<commit_message>
Check a document: mechanical fixes become tracked changes in the download
The marked-up .docx now carries real w:ins/w:del revisions (author
'Proof Positive') for issues with a deterministic fix; advisory findings
stay as comments. Rules with context risk are comments-only per Jen's
review (im2026/src/track-plan.js); documents that already contain
revisions fall back to comments with a warning. Safety demotions cover
overlapping issues, images/fields inside a fix range and offset drift.

Rule fixes from Jen's Word rounds: numbers-start-sentence ignores
abbreviation stops; 'approx.' expands to 'approximately';
date-ordinal-in-date handles 'the 3rd of March'; spelling-or matches
derived forms (favored, colors); date/time/unit fixes now insert
non-breaking spaces. Sample briefing regenerated (en-AU, 'released on',
no trailing 'etc.') and paste-tab example matched.

Co-Authored-By: Claude Fable 5 <noreply@anthropic.com>
</commit_message>
<xml_diff>
--- a/im2026/assets/sample-briefing.docx
+++ b/im2026/assets/sample-briefing.docx
@@ -12,7 +12,7 @@
     </w:p>
     <w:p>
       <w:r>
-        <w:t>Prepared by the Department of Unicorn Management for the Innovation Month 2026 demonstration. Every agency, program and unicorn in this document is fictional – the style problems are planted on purpose.</w:t>
+        <w:t>Prepared by the Department of Unicorn Management for the Innovation Month 2026 demonstration. Every agency, program and unicorn in this document is fictional, and the style problems are planted on purpose.</w:t>
       </w:r>
     </w:p>
     <w:p>
@@ -25,7 +25,7 @@
     </w:p>
     <w:p>
       <w:r>
-        <w:t>The Department of Unicorn Management announced a new strategy to modernize and optimize unicorn crossings across regional Australia. The review panel's report, released January 15, 2026, found that the crossing network could of been better managed.  It recommends that the department analyze usage data and adopt new sensor technology.</w:t>
+        <w:t>The Department of Unicorn Management announced a new strategy to modernize and optimize unicorn crossings across regional Australia. The review panel's report, released on January 15, 2026, found that the crossing network could of been better managed.  It recommends that the department analyze usage data and adopt new sensor technology.</w:t>
       </w:r>
     </w:p>
     <w:p>
@@ -85,7 +85,7 @@
         <w:pStyle w:val="ListBullet"/>
       </w:pPr>
       <w:r>
-        <w:t>Publish quarterly data on unicorn movements etc.</w:t>
+        <w:t>Publish quarterly data on unicorn movements.</w:t>
       </w:r>
     </w:p>
     <w:p>
@@ -325,7 +325,7 @@
         <w:rFonts w:asciiTheme="minorHAnsi" w:eastAsiaTheme="minorEastAsia" w:hAnsiTheme="minorHAnsi" w:cstheme="minorBidi"/>
         <w:sz w:val="22"/>
         <w:szCs w:val="22"/>
-        <w:lang w:val="en-US" w:eastAsia="en-US" w:bidi="ar-SA"/>
+        <w:lang w:val="en-AU" w:eastAsia="en-US" w:bidi="ar-SA"/>
       </w:rPr>
     </w:rPrDefault>
     <w:pPrDefault>

</xml_diff>